<commit_message>
Remove os prazos sugeridos do fluxo de elaboração na Nota Técnica
Co-Authored-By: Claude Sonnet 5.5 <noreply@anthropic.com>
Claude-Session: https://claude.ai/code/session_019hKSviCnF5ihoMnErm9Cu3
</commit_message>
<xml_diff>
--- a/Nota_Tecnica_ASSGER_Orientacao_TED.docx
+++ b/Nota_Tecnica_ASSGER_Orientacao_TED.docx
@@ -371,7 +371,7 @@
           <w:sz w:val="20"/>
           <w:szCs w:val="20"/>
         </w:rPr>
-        <w:t xml:space="preserve">baseado no POP-CENTRAL-001, com prazos sugeridos.</w:t>
+        <w:t xml:space="preserve">baseado no POP-CENTRAL-001.</w:t>
       </w:r>
     </w:p>
     <w:p>
@@ -6059,7 +6059,7 @@
           <w:sz w:val="18"/>
           <w:szCs w:val="18"/>
         </w:rPr>
-        <w:t xml:space="preserve">Baseado no POP-CENTRAL-001. Os prazos são sugestões, a ajustar com a área gestora.</w:t>
+        <w:t xml:space="preserve">Baseado no POP-CENTRAL-001.</w:t>
       </w:r>
     </w:p>
     <w:tbl>
@@ -6076,9 +6076,8 @@
       </w:tblPr>
       <w:tblGrid>
         <w:gridCol w:w="400"/>
-        <w:gridCol w:w="4300"/>
-        <w:gridCol w:w="2500"/>
-        <w:gridCol w:w="2438"/>
+        <w:gridCol w:w="6300"/>
+        <w:gridCol w:w="2938"/>
       </w:tblGrid>
       <w:tr>
         <w:trPr>
@@ -6120,7 +6119,7 @@
         </w:tc>
         <w:tc>
           <w:tcPr>
-            <w:tcW w:type="dxa" w:w="4300"/>
+            <w:tcW w:type="dxa" w:w="6300"/>
             <w:tcBorders>
               <w:top w:val="single" w:color="A6A6A6" w:sz="4"/>
               <w:left w:val="single" w:color="A6A6A6" w:sz="4"/>
@@ -6154,7 +6153,7 @@
         </w:tc>
         <w:tc>
           <w:tcPr>
-            <w:tcW w:type="dxa" w:w="2500"/>
+            <w:tcW w:type="dxa" w:w="2938"/>
             <w:tcBorders>
               <w:top w:val="single" w:color="A6A6A6" w:sz="4"/>
               <w:left w:val="single" w:color="A6A6A6" w:sz="4"/>
@@ -6183,40 +6182,6 @@
                 <w:szCs w:val="18"/>
               </w:rPr>
               <w:t xml:space="preserve">Responsável</w:t>
-            </w:r>
-          </w:p>
-        </w:tc>
-        <w:tc>
-          <w:tcPr>
-            <w:tcW w:type="dxa" w:w="2438"/>
-            <w:tcBorders>
-              <w:top w:val="single" w:color="A6A6A6" w:sz="4"/>
-              <w:left w:val="single" w:color="A6A6A6" w:sz="4"/>
-              <w:bottom w:val="single" w:color="A6A6A6" w:sz="4"/>
-              <w:right w:val="single" w:color="A6A6A6" w:sz="4"/>
-            </w:tcBorders>
-            <w:shd w:fill="D9E2F3" w:color="auto" w:val="clear"/>
-            <w:tcMar>
-              <w:top w:type="dxa" w:w="60"/>
-              <w:left w:type="dxa" w:w="90"/>
-              <w:bottom w:type="dxa" w:w="60"/>
-              <w:right w:type="dxa" w:w="90"/>
-            </w:tcMar>
-          </w:tcPr>
-          <w:p>
-            <w:pPr>
-              <w:spacing w:after="0"/>
-            </w:pPr>
-            <w:r>
-              <w:rPr>
-                <w:rFonts w:ascii="Arial" w:cs="Arial" w:eastAsia="Arial" w:hAnsi="Arial"/>
-                <w:b/>
-                <w:bCs/>
-                <w:color w:val="1F3864"/>
-                <w:sz w:val="18"/>
-                <w:szCs w:val="18"/>
-              </w:rPr>
-              <w:t xml:space="preserve">Prazo sugerido</w:t>
             </w:r>
           </w:p>
         </w:tc>
@@ -6259,39 +6224,39 @@
         </w:tc>
         <w:tc>
           <w:tcPr>
-            <w:tcW w:type="dxa" w:w="4300"/>
-            <w:tcBorders>
-              <w:top w:val="single" w:color="A6A6A6" w:sz="4"/>
-              <w:left w:val="single" w:color="A6A6A6" w:sz="4"/>
-              <w:bottom w:val="single" w:color="A6A6A6" w:sz="4"/>
-              <w:right w:val="single" w:color="A6A6A6" w:sz="4"/>
-            </w:tcBorders>
-            <w:tcMar>
-              <w:top w:type="dxa" w:w="60"/>
-              <w:left w:type="dxa" w:w="90"/>
-              <w:bottom w:type="dxa" w:w="60"/>
-              <w:right w:type="dxa" w:w="90"/>
-            </w:tcMar>
-          </w:tcPr>
-          <w:p>
-            <w:pPr>
-              <w:spacing w:after="0"/>
-            </w:pPr>
-            <w:r>
-              <w:rPr>
-                <w:rFonts w:ascii="Arial" w:cs="Arial" w:eastAsia="Arial" w:hAnsi="Arial"/>
-                <w:b w:val="false"/>
-                <w:bCs w:val="false"/>
-                <w:sz w:val="18"/>
-                <w:szCs w:val="18"/>
-              </w:rPr>
-              <w:t xml:space="preserve">Registrar a DIRPLA como área gestora e a base de competência</w:t>
-            </w:r>
-          </w:p>
-        </w:tc>
-        <w:tc>
-          <w:tcPr>
-            <w:tcW w:type="dxa" w:w="2500"/>
+            <w:tcW w:type="dxa" w:w="6300"/>
+            <w:tcBorders>
+              <w:top w:val="single" w:color="A6A6A6" w:sz="4"/>
+              <w:left w:val="single" w:color="A6A6A6" w:sz="4"/>
+              <w:bottom w:val="single" w:color="A6A6A6" w:sz="4"/>
+              <w:right w:val="single" w:color="A6A6A6" w:sz="4"/>
+            </w:tcBorders>
+            <w:tcMar>
+              <w:top w:type="dxa" w:w="60"/>
+              <w:left w:type="dxa" w:w="90"/>
+              <w:bottom w:type="dxa" w:w="60"/>
+              <w:right w:type="dxa" w:w="90"/>
+            </w:tcMar>
+          </w:tcPr>
+          <w:p>
+            <w:pPr>
+              <w:spacing w:after="0"/>
+            </w:pPr>
+            <w:r>
+              <w:rPr>
+                <w:rFonts w:ascii="Arial" w:cs="Arial" w:eastAsia="Arial" w:hAnsi="Arial"/>
+                <w:b w:val="false"/>
+                <w:bCs w:val="false"/>
+                <w:sz w:val="18"/>
+                <w:szCs w:val="18"/>
+              </w:rPr>
+              <w:t xml:space="preserve">Registrar a DIRPLA como área gestora e a base de competência, na reunião já prevista</w:t>
+            </w:r>
+          </w:p>
+        </w:tc>
+        <w:tc>
+          <w:tcPr>
+            <w:tcW w:type="dxa" w:w="2938"/>
             <w:tcBorders>
               <w:top w:val="single" w:color="A6A6A6" w:sz="4"/>
               <w:left w:val="single" w:color="A6A6A6" w:sz="4"/>
@@ -6318,38 +6283,6 @@
                 <w:szCs w:val="18"/>
               </w:rPr>
               <w:t xml:space="preserve">Diretoria Executiva</w:t>
-            </w:r>
-          </w:p>
-        </w:tc>
-        <w:tc>
-          <w:tcPr>
-            <w:tcW w:type="dxa" w:w="2438"/>
-            <w:tcBorders>
-              <w:top w:val="single" w:color="A6A6A6" w:sz="4"/>
-              <w:left w:val="single" w:color="A6A6A6" w:sz="4"/>
-              <w:bottom w:val="single" w:color="A6A6A6" w:sz="4"/>
-              <w:right w:val="single" w:color="A6A6A6" w:sz="4"/>
-            </w:tcBorders>
-            <w:tcMar>
-              <w:top w:type="dxa" w:w="60"/>
-              <w:left w:type="dxa" w:w="90"/>
-              <w:bottom w:type="dxa" w:w="60"/>
-              <w:right w:type="dxa" w:w="90"/>
-            </w:tcMar>
-          </w:tcPr>
-          <w:p>
-            <w:pPr>
-              <w:spacing w:after="0"/>
-            </w:pPr>
-            <w:r>
-              <w:rPr>
-                <w:rFonts w:ascii="Arial" w:cs="Arial" w:eastAsia="Arial" w:hAnsi="Arial"/>
-                <w:b w:val="false"/>
-                <w:bCs w:val="false"/>
-                <w:sz w:val="18"/>
-                <w:szCs w:val="18"/>
-              </w:rPr>
-              <w:t xml:space="preserve">Na reunião já prevista</w:t>
             </w:r>
           </w:p>
         </w:tc>
@@ -6392,7 +6325,7 @@
         </w:tc>
         <w:tc>
           <w:tcPr>
-            <w:tcW w:type="dxa" w:w="4300"/>
+            <w:tcW w:type="dxa" w:w="6300"/>
             <w:tcBorders>
               <w:top w:val="single" w:color="A6A6A6" w:sz="4"/>
               <w:left w:val="single" w:color="A6A6A6" w:sz="4"/>
@@ -6424,7 +6357,7 @@
         </w:tc>
         <w:tc>
           <w:tcPr>
-            <w:tcW w:type="dxa" w:w="2500"/>
+            <w:tcW w:type="dxa" w:w="2938"/>
             <w:tcBorders>
               <w:top w:val="single" w:color="A6A6A6" w:sz="4"/>
               <w:left w:val="single" w:color="A6A6A6" w:sz="4"/>
@@ -6451,38 +6384,6 @@
                 <w:szCs w:val="18"/>
               </w:rPr>
               <w:t xml:space="preserve">Diretor da DIRPLA</w:t>
-            </w:r>
-          </w:p>
-        </w:tc>
-        <w:tc>
-          <w:tcPr>
-            <w:tcW w:type="dxa" w:w="2438"/>
-            <w:tcBorders>
-              <w:top w:val="single" w:color="A6A6A6" w:sz="4"/>
-              <w:left w:val="single" w:color="A6A6A6" w:sz="4"/>
-              <w:bottom w:val="single" w:color="A6A6A6" w:sz="4"/>
-              <w:right w:val="single" w:color="A6A6A6" w:sz="4"/>
-            </w:tcBorders>
-            <w:tcMar>
-              <w:top w:type="dxa" w:w="60"/>
-              <w:left w:type="dxa" w:w="90"/>
-              <w:bottom w:type="dxa" w:w="60"/>
-              <w:right w:type="dxa" w:w="90"/>
-            </w:tcMar>
-          </w:tcPr>
-          <w:p>
-            <w:pPr>
-              <w:spacing w:after="0"/>
-            </w:pPr>
-            <w:r>
-              <w:rPr>
-                <w:rFonts w:ascii="Arial" w:cs="Arial" w:eastAsia="Arial" w:hAnsi="Arial"/>
-                <w:b w:val="false"/>
-                <w:bCs w:val="false"/>
-                <w:sz w:val="18"/>
-                <w:szCs w:val="18"/>
-              </w:rPr>
-              <w:t xml:space="preserve">5 dias úteis após a decisão</w:t>
             </w:r>
           </w:p>
         </w:tc>
@@ -6525,7 +6426,7 @@
         </w:tc>
         <w:tc>
           <w:tcPr>
-            <w:tcW w:type="dxa" w:w="4300"/>
+            <w:tcW w:type="dxa" w:w="6300"/>
             <w:tcBorders>
               <w:top w:val="single" w:color="A6A6A6" w:sz="4"/>
               <w:left w:val="single" w:color="A6A6A6" w:sz="4"/>
@@ -6557,7 +6458,7 @@
         </w:tc>
         <w:tc>
           <w:tcPr>
-            <w:tcW w:type="dxa" w:w="2500"/>
+            <w:tcW w:type="dxa" w:w="2938"/>
             <w:tcBorders>
               <w:top w:val="single" w:color="A6A6A6" w:sz="4"/>
               <w:left w:val="single" w:color="A6A6A6" w:sz="4"/>
@@ -6584,38 +6485,6 @@
                 <w:szCs w:val="18"/>
               </w:rPr>
               <w:t xml:space="preserve">ASSGER</w:t>
-            </w:r>
-          </w:p>
-        </w:tc>
-        <w:tc>
-          <w:tcPr>
-            <w:tcW w:type="dxa" w:w="2438"/>
-            <w:tcBorders>
-              <w:top w:val="single" w:color="A6A6A6" w:sz="4"/>
-              <w:left w:val="single" w:color="A6A6A6" w:sz="4"/>
-              <w:bottom w:val="single" w:color="A6A6A6" w:sz="4"/>
-              <w:right w:val="single" w:color="A6A6A6" w:sz="4"/>
-            </w:tcBorders>
-            <w:tcMar>
-              <w:top w:type="dxa" w:w="60"/>
-              <w:left w:type="dxa" w:w="90"/>
-              <w:bottom w:type="dxa" w:w="60"/>
-              <w:right w:type="dxa" w:w="90"/>
-            </w:tcMar>
-          </w:tcPr>
-          <w:p>
-            <w:pPr>
-              <w:spacing w:after="0"/>
-            </w:pPr>
-            <w:r>
-              <w:rPr>
-                <w:rFonts w:ascii="Arial" w:cs="Arial" w:eastAsia="Arial" w:hAnsi="Arial"/>
-                <w:b w:val="false"/>
-                <w:bCs w:val="false"/>
-                <w:sz w:val="18"/>
-                <w:szCs w:val="18"/>
-              </w:rPr>
-              <w:t xml:space="preserve">5 dias úteis após a decisão</w:t>
             </w:r>
           </w:p>
         </w:tc>
@@ -6658,7 +6527,7 @@
         </w:tc>
         <w:tc>
           <w:tcPr>
-            <w:tcW w:type="dxa" w:w="4300"/>
+            <w:tcW w:type="dxa" w:w="6300"/>
             <w:tcBorders>
               <w:top w:val="single" w:color="A6A6A6" w:sz="4"/>
               <w:left w:val="single" w:color="A6A6A6" w:sz="4"/>
@@ -6690,7 +6559,7 @@
         </w:tc>
         <w:tc>
           <w:tcPr>
-            <w:tcW w:type="dxa" w:w="2500"/>
+            <w:tcW w:type="dxa" w:w="2938"/>
             <w:tcBorders>
               <w:top w:val="single" w:color="A6A6A6" w:sz="4"/>
               <w:left w:val="single" w:color="A6A6A6" w:sz="4"/>
@@ -6717,38 +6586,6 @@
                 <w:szCs w:val="18"/>
               </w:rPr>
               <w:t xml:space="preserve">DIRPLA com as áreas corresponsáveis</w:t>
-            </w:r>
-          </w:p>
-        </w:tc>
-        <w:tc>
-          <w:tcPr>
-            <w:tcW w:type="dxa" w:w="2438"/>
-            <w:tcBorders>
-              <w:top w:val="single" w:color="A6A6A6" w:sz="4"/>
-              <w:left w:val="single" w:color="A6A6A6" w:sz="4"/>
-              <w:bottom w:val="single" w:color="A6A6A6" w:sz="4"/>
-              <w:right w:val="single" w:color="A6A6A6" w:sz="4"/>
-            </w:tcBorders>
-            <w:tcMar>
-              <w:top w:type="dxa" w:w="60"/>
-              <w:left w:type="dxa" w:w="90"/>
-              <w:bottom w:type="dxa" w:w="60"/>
-              <w:right w:type="dxa" w:w="90"/>
-            </w:tcMar>
-          </w:tcPr>
-          <w:p>
-            <w:pPr>
-              <w:spacing w:after="0"/>
-            </w:pPr>
-            <w:r>
-              <w:rPr>
-                <w:rFonts w:ascii="Arial" w:cs="Arial" w:eastAsia="Arial" w:hAnsi="Arial"/>
-                <w:b w:val="false"/>
-                <w:bCs w:val="false"/>
-                <w:sz w:val="18"/>
-                <w:szCs w:val="18"/>
-              </w:rPr>
-              <w:t xml:space="preserve">20 dias úteis</w:t>
             </w:r>
           </w:p>
         </w:tc>
@@ -6791,7 +6628,7 @@
         </w:tc>
         <w:tc>
           <w:tcPr>
-            <w:tcW w:type="dxa" w:w="4300"/>
+            <w:tcW w:type="dxa" w:w="6300"/>
             <w:tcBorders>
               <w:top w:val="single" w:color="A6A6A6" w:sz="4"/>
               <w:left w:val="single" w:color="A6A6A6" w:sz="4"/>
@@ -6823,7 +6660,7 @@
         </w:tc>
         <w:tc>
           <w:tcPr>
-            <w:tcW w:type="dxa" w:w="2500"/>
+            <w:tcW w:type="dxa" w:w="2938"/>
             <w:tcBorders>
               <w:top w:val="single" w:color="A6A6A6" w:sz="4"/>
               <w:left w:val="single" w:color="A6A6A6" w:sz="4"/>
@@ -6850,38 +6687,6 @@
                 <w:szCs w:val="18"/>
               </w:rPr>
               <w:t xml:space="preserve">DIRPLA</w:t>
-            </w:r>
-          </w:p>
-        </w:tc>
-        <w:tc>
-          <w:tcPr>
-            <w:tcW w:type="dxa" w:w="2438"/>
-            <w:tcBorders>
-              <w:top w:val="single" w:color="A6A6A6" w:sz="4"/>
-              <w:left w:val="single" w:color="A6A6A6" w:sz="4"/>
-              <w:bottom w:val="single" w:color="A6A6A6" w:sz="4"/>
-              <w:right w:val="single" w:color="A6A6A6" w:sz="4"/>
-            </w:tcBorders>
-            <w:tcMar>
-              <w:top w:type="dxa" w:w="60"/>
-              <w:left w:type="dxa" w:w="90"/>
-              <w:bottom w:type="dxa" w:w="60"/>
-              <w:right w:type="dxa" w:w="90"/>
-            </w:tcMar>
-          </w:tcPr>
-          <w:p>
-            <w:pPr>
-              <w:spacing w:after="0"/>
-            </w:pPr>
-            <w:r>
-              <w:rPr>
-                <w:rFonts w:ascii="Arial" w:cs="Arial" w:eastAsia="Arial" w:hAnsi="Arial"/>
-                <w:b w:val="false"/>
-                <w:bCs w:val="false"/>
-                <w:sz w:val="18"/>
-                <w:szCs w:val="18"/>
-              </w:rPr>
-              <w:t xml:space="preserve">15 dias úteis, em paralelo à etapa 4</w:t>
             </w:r>
           </w:p>
         </w:tc>
@@ -6924,7 +6729,7 @@
         </w:tc>
         <w:tc>
           <w:tcPr>
-            <w:tcW w:type="dxa" w:w="4300"/>
+            <w:tcW w:type="dxa" w:w="6300"/>
             <w:tcBorders>
               <w:top w:val="single" w:color="A6A6A6" w:sz="4"/>
               <w:left w:val="single" w:color="A6A6A6" w:sz="4"/>
@@ -6956,7 +6761,7 @@
         </w:tc>
         <w:tc>
           <w:tcPr>
-            <w:tcW w:type="dxa" w:w="2500"/>
+            <w:tcW w:type="dxa" w:w="2938"/>
             <w:tcBorders>
               <w:top w:val="single" w:color="A6A6A6" w:sz="4"/>
               <w:left w:val="single" w:color="A6A6A6" w:sz="4"/>
@@ -6983,38 +6788,6 @@
                 <w:szCs w:val="18"/>
               </w:rPr>
               <w:t xml:space="preserve">DIRPLA</w:t>
-            </w:r>
-          </w:p>
-        </w:tc>
-        <w:tc>
-          <w:tcPr>
-            <w:tcW w:type="dxa" w:w="2438"/>
-            <w:tcBorders>
-              <w:top w:val="single" w:color="A6A6A6" w:sz="4"/>
-              <w:left w:val="single" w:color="A6A6A6" w:sz="4"/>
-              <w:bottom w:val="single" w:color="A6A6A6" w:sz="4"/>
-              <w:right w:val="single" w:color="A6A6A6" w:sz="4"/>
-            </w:tcBorders>
-            <w:tcMar>
-              <w:top w:type="dxa" w:w="60"/>
-              <w:left w:type="dxa" w:w="90"/>
-              <w:bottom w:type="dxa" w:w="60"/>
-              <w:right w:type="dxa" w:w="90"/>
-            </w:tcMar>
-          </w:tcPr>
-          <w:p>
-            <w:pPr>
-              <w:spacing w:after="0"/>
-            </w:pPr>
-            <w:r>
-              <w:rPr>
-                <w:rFonts w:ascii="Arial" w:cs="Arial" w:eastAsia="Arial" w:hAnsi="Arial"/>
-                <w:b w:val="false"/>
-                <w:bCs w:val="false"/>
-                <w:sz w:val="18"/>
-                <w:szCs w:val="18"/>
-              </w:rPr>
-              <w:t xml:space="preserve">5 dias úteis</w:t>
             </w:r>
           </w:p>
         </w:tc>
@@ -7057,7 +6830,7 @@
         </w:tc>
         <w:tc>
           <w:tcPr>
-            <w:tcW w:type="dxa" w:w="4300"/>
+            <w:tcW w:type="dxa" w:w="6300"/>
             <w:tcBorders>
               <w:top w:val="single" w:color="A6A6A6" w:sz="4"/>
               <w:left w:val="single" w:color="A6A6A6" w:sz="4"/>
@@ -7089,7 +6862,7 @@
         </w:tc>
         <w:tc>
           <w:tcPr>
-            <w:tcW w:type="dxa" w:w="2500"/>
+            <w:tcW w:type="dxa" w:w="2938"/>
             <w:tcBorders>
               <w:top w:val="single" w:color="A6A6A6" w:sz="4"/>
               <w:left w:val="single" w:color="A6A6A6" w:sz="4"/>
@@ -7116,38 +6889,6 @@
                 <w:szCs w:val="18"/>
               </w:rPr>
               <w:t xml:space="preserve">ASSGER</w:t>
-            </w:r>
-          </w:p>
-        </w:tc>
-        <w:tc>
-          <w:tcPr>
-            <w:tcW w:type="dxa" w:w="2438"/>
-            <w:tcBorders>
-              <w:top w:val="single" w:color="A6A6A6" w:sz="4"/>
-              <w:left w:val="single" w:color="A6A6A6" w:sz="4"/>
-              <w:bottom w:val="single" w:color="A6A6A6" w:sz="4"/>
-              <w:right w:val="single" w:color="A6A6A6" w:sz="4"/>
-            </w:tcBorders>
-            <w:tcMar>
-              <w:top w:type="dxa" w:w="60"/>
-              <w:left w:type="dxa" w:w="90"/>
-              <w:bottom w:type="dxa" w:w="60"/>
-              <w:right w:type="dxa" w:w="90"/>
-            </w:tcMar>
-          </w:tcPr>
-          <w:p>
-            <w:pPr>
-              <w:spacing w:after="0"/>
-            </w:pPr>
-            <w:r>
-              <w:rPr>
-                <w:rFonts w:ascii="Arial" w:cs="Arial" w:eastAsia="Arial" w:hAnsi="Arial"/>
-                <w:b w:val="false"/>
-                <w:bCs w:val="false"/>
-                <w:sz w:val="18"/>
-                <w:szCs w:val="18"/>
-              </w:rPr>
-              <w:t xml:space="preserve">10 dias úteis do recebimento</w:t>
             </w:r>
           </w:p>
         </w:tc>
@@ -7190,7 +6931,7 @@
         </w:tc>
         <w:tc>
           <w:tcPr>
-            <w:tcW w:type="dxa" w:w="4300"/>
+            <w:tcW w:type="dxa" w:w="6300"/>
             <w:tcBorders>
               <w:top w:val="single" w:color="A6A6A6" w:sz="4"/>
               <w:left w:val="single" w:color="A6A6A6" w:sz="4"/>
@@ -7222,7 +6963,7 @@
         </w:tc>
         <w:tc>
           <w:tcPr>
-            <w:tcW w:type="dxa" w:w="2500"/>
+            <w:tcW w:type="dxa" w:w="2938"/>
             <w:tcBorders>
               <w:top w:val="single" w:color="A6A6A6" w:sz="4"/>
               <w:left w:val="single" w:color="A6A6A6" w:sz="4"/>
@@ -7249,38 +6990,6 @@
                 <w:szCs w:val="18"/>
               </w:rPr>
               <w:t xml:space="preserve">ASSJUR</w:t>
-            </w:r>
-          </w:p>
-        </w:tc>
-        <w:tc>
-          <w:tcPr>
-            <w:tcW w:type="dxa" w:w="2438"/>
-            <w:tcBorders>
-              <w:top w:val="single" w:color="A6A6A6" w:sz="4"/>
-              <w:left w:val="single" w:color="A6A6A6" w:sz="4"/>
-              <w:bottom w:val="single" w:color="A6A6A6" w:sz="4"/>
-              <w:right w:val="single" w:color="A6A6A6" w:sz="4"/>
-            </w:tcBorders>
-            <w:tcMar>
-              <w:top w:type="dxa" w:w="60"/>
-              <w:left w:type="dxa" w:w="90"/>
-              <w:bottom w:type="dxa" w:w="60"/>
-              <w:right w:type="dxa" w:w="90"/>
-            </w:tcMar>
-          </w:tcPr>
-          <w:p>
-            <w:pPr>
-              <w:spacing w:after="0"/>
-            </w:pPr>
-            <w:r>
-              <w:rPr>
-                <w:rFonts w:ascii="Arial" w:cs="Arial" w:eastAsia="Arial" w:hAnsi="Arial"/>
-                <w:b w:val="false"/>
-                <w:bCs w:val="false"/>
-                <w:sz w:val="18"/>
-                <w:szCs w:val="18"/>
-              </w:rPr>
-              <w:t xml:space="preserve">Conforme a ASSJUR</w:t>
             </w:r>
           </w:p>
         </w:tc>
@@ -7323,7 +7032,7 @@
         </w:tc>
         <w:tc>
           <w:tcPr>
-            <w:tcW w:type="dxa" w:w="4300"/>
+            <w:tcW w:type="dxa" w:w="6300"/>
             <w:tcBorders>
               <w:top w:val="single" w:color="A6A6A6" w:sz="4"/>
               <w:left w:val="single" w:color="A6A6A6" w:sz="4"/>
@@ -7355,7 +7064,7 @@
         </w:tc>
         <w:tc>
           <w:tcPr>
-            <w:tcW w:type="dxa" w:w="2500"/>
+            <w:tcW w:type="dxa" w:w="2938"/>
             <w:tcBorders>
               <w:top w:val="single" w:color="A6A6A6" w:sz="4"/>
               <w:left w:val="single" w:color="A6A6A6" w:sz="4"/>
@@ -7382,38 +7091,6 @@
                 <w:szCs w:val="18"/>
               </w:rPr>
               <w:t xml:space="preserve">Diretoria Executiva</w:t>
-            </w:r>
-          </w:p>
-        </w:tc>
-        <w:tc>
-          <w:tcPr>
-            <w:tcW w:type="dxa" w:w="2438"/>
-            <w:tcBorders>
-              <w:top w:val="single" w:color="A6A6A6" w:sz="4"/>
-              <w:left w:val="single" w:color="A6A6A6" w:sz="4"/>
-              <w:bottom w:val="single" w:color="A6A6A6" w:sz="4"/>
-              <w:right w:val="single" w:color="A6A6A6" w:sz="4"/>
-            </w:tcBorders>
-            <w:tcMar>
-              <w:top w:type="dxa" w:w="60"/>
-              <w:left w:type="dxa" w:w="90"/>
-              <w:bottom w:type="dxa" w:w="60"/>
-              <w:right w:type="dxa" w:w="90"/>
-            </w:tcMar>
-          </w:tcPr>
-          <w:p>
-            <w:pPr>
-              <w:spacing w:after="0"/>
-            </w:pPr>
-            <w:r>
-              <w:rPr>
-                <w:rFonts w:ascii="Arial" w:cs="Arial" w:eastAsia="Arial" w:hAnsi="Arial"/>
-                <w:b w:val="false"/>
-                <w:bCs w:val="false"/>
-                <w:sz w:val="18"/>
-                <w:szCs w:val="18"/>
-              </w:rPr>
-              <w:t xml:space="preserve">Reunião seguinte</w:t>
             </w:r>
           </w:p>
         </w:tc>
@@ -7456,7 +7133,7 @@
         </w:tc>
         <w:tc>
           <w:tcPr>
-            <w:tcW w:type="dxa" w:w="4300"/>
+            <w:tcW w:type="dxa" w:w="6300"/>
             <w:tcBorders>
               <w:top w:val="single" w:color="A6A6A6" w:sz="4"/>
               <w:left w:val="single" w:color="A6A6A6" w:sz="4"/>
@@ -7488,7 +7165,7 @@
         </w:tc>
         <w:tc>
           <w:tcPr>
-            <w:tcW w:type="dxa" w:w="2500"/>
+            <w:tcW w:type="dxa" w:w="2938"/>
             <w:tcBorders>
               <w:top w:val="single" w:color="A6A6A6" w:sz="4"/>
               <w:left w:val="single" w:color="A6A6A6" w:sz="4"/>
@@ -7515,38 +7192,6 @@
                 <w:szCs w:val="18"/>
               </w:rPr>
               <w:t xml:space="preserve">ASSTAD</w:t>
-            </w:r>
-          </w:p>
-        </w:tc>
-        <w:tc>
-          <w:tcPr>
-            <w:tcW w:type="dxa" w:w="2438"/>
-            <w:tcBorders>
-              <w:top w:val="single" w:color="A6A6A6" w:sz="4"/>
-              <w:left w:val="single" w:color="A6A6A6" w:sz="4"/>
-              <w:bottom w:val="single" w:color="A6A6A6" w:sz="4"/>
-              <w:right w:val="single" w:color="A6A6A6" w:sz="4"/>
-            </w:tcBorders>
-            <w:tcMar>
-              <w:top w:type="dxa" w:w="60"/>
-              <w:left w:type="dxa" w:w="90"/>
-              <w:bottom w:type="dxa" w:w="60"/>
-              <w:right w:type="dxa" w:w="90"/>
-            </w:tcMar>
-          </w:tcPr>
-          <w:p>
-            <w:pPr>
-              <w:spacing w:after="0"/>
-            </w:pPr>
-            <w:r>
-              <w:rPr>
-                <w:rFonts w:ascii="Arial" w:cs="Arial" w:eastAsia="Arial" w:hAnsi="Arial"/>
-                <w:b w:val="false"/>
-                <w:bCs w:val="false"/>
-                <w:sz w:val="18"/>
-                <w:szCs w:val="18"/>
-              </w:rPr>
-              <w:t xml:space="preserve">Após a aprovação</w:t>
             </w:r>
           </w:p>
         </w:tc>
@@ -7965,7 +7610,7 @@
         </w:rPr>
         <w:t xml:space="preserve">Política de Gestão de Riscos, Conformidade e Controles Internos: arts. 20, 25, 27, 46, 48 a 51. Disponível em </w:t>
       </w:r>
-      <w:hyperlink w:history="1" r:id="rIdug7vfvezfdjmeb4lbo6pz">
+      <w:hyperlink w:history="1" r:id="rIdvnhi5b9r90cjx5tltbbb8">
         <w:r>
           <w:rPr>
             <w:rStyle w:val="Hyperlink"/>
@@ -8022,7 +7667,7 @@
         </w:rPr>
         <w:t xml:space="preserve">POP-CENTRAL-001, Procedimento para Elaboração de Instrumentos Normativos, v2.0: itens 5, 6 e 7. Disponível em </w:t>
       </w:r>
-      <w:hyperlink w:history="1" r:id="rIdafki2ofbf10c-sknfctyz">
+      <w:hyperlink w:history="1" r:id="rIds_bl-tugrs-jn-tlbnbhf">
         <w:r>
           <w:rPr>
             <w:rStyle w:val="Hyperlink"/>

</xml_diff>

<commit_message>
Retira a Política de Gestão de Riscos e a Matriz da Nota e do Despacho
Co-Authored-By: Claude Sonnet 5.5 <noreply@anthropic.com>
Claude-Session: https://claude.ai/code/session_019hKSviCnF5ihoMnErm9Cu3
</commit_message>
<xml_diff>
--- a/Nota_Tecnica_ASSGER_Orientacao_TED.docx
+++ b/Nota_Tecnica_ASSGER_Orientacao_TED.docx
@@ -303,7 +303,7 @@
           <w:sz w:val="20"/>
           <w:szCs w:val="20"/>
         </w:rPr>
-        <w:t xml:space="preserve">Os gestores de área mapeiam os processos e riscos e elaboram os normativos com os controles necessários (Política de Gestão de Riscos, arts. 49, XII, e 50). A seção 6 traz os riscos que a Auditoria já evidenciou. A minuta deve vir acompanhada do mapeamento e da Matriz de Riscos.</w:t>
+        <w:t xml:space="preserve">A área gestora mapeia o processo e os riscos e elabora a Norma com os controles necessários. A seção 6 traz os riscos que a Auditoria já evidenciou. A minuta deve vir acompanhada do mapeamento de riscos e controles.</w:t>
       </w:r>
     </w:p>
     <w:p>
@@ -3222,7 +3222,7 @@
                 <w:sz w:val="18"/>
                 <w:szCs w:val="18"/>
               </w:rPr>
-              <w:t xml:space="preserve">Estatuto, art. 72; Regimento, art. 18; Política de Riscos, arts. 46, II, e 51</w:t>
+              <w:t xml:space="preserve">Estatuto, art. 72; Regimento, art. 18</w:t>
             </w:r>
           </w:p>
         </w:tc>
@@ -3323,7 +3323,7 @@
                 <w:sz w:val="18"/>
                 <w:szCs w:val="18"/>
               </w:rPr>
-              <w:t xml:space="preserve">Regimento, art. 13; Política de Riscos, art. 46, III</w:t>
+              <w:t xml:space="preserve">Regimento, art. 13</w:t>
             </w:r>
           </w:p>
         </w:tc>
@@ -4938,107 +4938,6 @@
           </w:p>
         </w:tc>
       </w:tr>
-      <w:tr>
-        <w:trPr>
-          <w:cantSplit/>
-        </w:trPr>
-        <w:tc>
-          <w:tcPr>
-            <w:tcW w:type="dxa" w:w="4200"/>
-            <w:tcBorders>
-              <w:top w:val="single" w:color="A6A6A6" w:sz="4"/>
-              <w:left w:val="single" w:color="A6A6A6" w:sz="4"/>
-              <w:bottom w:val="single" w:color="A6A6A6" w:sz="4"/>
-              <w:right w:val="single" w:color="A6A6A6" w:sz="4"/>
-            </w:tcBorders>
-            <w:tcMar>
-              <w:top w:type="dxa" w:w="60"/>
-              <w:left w:type="dxa" w:w="90"/>
-              <w:bottom w:type="dxa" w:w="60"/>
-              <w:right w:type="dxa" w:w="90"/>
-            </w:tcMar>
-          </w:tcPr>
-          <w:p>
-            <w:pPr>
-              <w:spacing w:after="0"/>
-            </w:pPr>
-            <w:r>
-              <w:rPr>
-                <w:rFonts w:ascii="Arial" w:cs="Arial" w:eastAsia="Arial" w:hAnsi="Arial"/>
-                <w:b w:val="false"/>
-                <w:bCs w:val="false"/>
-                <w:sz w:val="18"/>
-                <w:szCs w:val="18"/>
-              </w:rPr>
-              <w:t xml:space="preserve">Relatório semestral de riscos à Diretoria Executiva, incluindo os TEDs</w:t>
-            </w:r>
-          </w:p>
-        </w:tc>
-        <w:tc>
-          <w:tcPr>
-            <w:tcW w:type="dxa" w:w="1500"/>
-            <w:tcBorders>
-              <w:top w:val="single" w:color="A6A6A6" w:sz="4"/>
-              <w:left w:val="single" w:color="A6A6A6" w:sz="4"/>
-              <w:bottom w:val="single" w:color="A6A6A6" w:sz="4"/>
-              <w:right w:val="single" w:color="A6A6A6" w:sz="4"/>
-            </w:tcBorders>
-            <w:tcMar>
-              <w:top w:type="dxa" w:w="60"/>
-              <w:left w:type="dxa" w:w="90"/>
-              <w:bottom w:type="dxa" w:w="60"/>
-              <w:right w:type="dxa" w:w="90"/>
-            </w:tcMar>
-          </w:tcPr>
-          <w:p>
-            <w:pPr>
-              <w:spacing w:after="0"/>
-            </w:pPr>
-            <w:r>
-              <w:rPr>
-                <w:rFonts w:ascii="Arial" w:cs="Arial" w:eastAsia="Arial" w:hAnsi="Arial"/>
-                <w:b w:val="false"/>
-                <w:bCs w:val="false"/>
-                <w:sz w:val="18"/>
-                <w:szCs w:val="18"/>
-              </w:rPr>
-              <w:t xml:space="preserve">Detectivo</w:t>
-            </w:r>
-          </w:p>
-        </w:tc>
-        <w:tc>
-          <w:tcPr>
-            <w:tcW w:type="dxa" w:w="3938"/>
-            <w:tcBorders>
-              <w:top w:val="single" w:color="A6A6A6" w:sz="4"/>
-              <w:left w:val="single" w:color="A6A6A6" w:sz="4"/>
-              <w:bottom w:val="single" w:color="A6A6A6" w:sz="4"/>
-              <w:right w:val="single" w:color="A6A6A6" w:sz="4"/>
-            </w:tcBorders>
-            <w:tcMar>
-              <w:top w:type="dxa" w:w="60"/>
-              <w:left w:type="dxa" w:w="90"/>
-              <w:bottom w:type="dxa" w:w="60"/>
-              <w:right w:type="dxa" w:w="90"/>
-            </w:tcMar>
-          </w:tcPr>
-          <w:p>
-            <w:pPr>
-              <w:spacing w:after="0"/>
-            </w:pPr>
-            <w:r>
-              <w:rPr>
-                <w:rFonts w:ascii="Arial" w:cs="Arial" w:eastAsia="Arial" w:hAnsi="Arial"/>
-                <w:b w:val="false"/>
-                <w:bCs w:val="false"/>
-                <w:sz w:val="18"/>
-                <w:szCs w:val="18"/>
-              </w:rPr>
-              <w:t xml:space="preserve">Visibilidade dos riscos elevados e extremos (Política de Riscos, art. 27)</w:t>
-            </w:r>
-          </w:p>
-        </w:tc>
-      </w:tr>
     </w:tbl>
     <w:p>
       <w:pPr>
@@ -5069,7 +4968,7 @@
           <w:sz w:val="18"/>
           <w:szCs w:val="18"/>
         </w:rPr>
-        <w:t xml:space="preserve">Lista inicial, a partir do que a Auditoria já evidenciou. A área gestora a completa com as áreas corresponsáveis e classifica cada risco em baixo, médio, elevado ou extremo (Política de Riscos, arts. 20 e 25).</w:t>
+        <w:t xml:space="preserve">Lista inicial, a partir do que a Auditoria já evidenciou. A área gestora a completa com as áreas corresponsáveis, registra os controles e define as respostas.</w:t>
       </w:r>
     </w:p>
     <w:tbl>
@@ -6452,7 +6351,7 @@
                 <w:sz w:val="18"/>
                 <w:szCs w:val="18"/>
               </w:rPr>
-              <w:t xml:space="preserve">Entregar o modelo de mapeamento e a Matriz de Riscos (POP-001, item 7.2.4)</w:t>
+              <w:t xml:space="preserve">Entregar o roteiro de registro de riscos e controles (POP-001, itens 7.2.2 e 7.2.3)</w:t>
             </w:r>
           </w:p>
         </w:tc>
@@ -6553,7 +6452,7 @@
                 <w:sz w:val="18"/>
                 <w:szCs w:val="18"/>
               </w:rPr>
-              <w:t xml:space="preserve">Mapear o processo e os riscos, com Matriz de Riscos e plano de ação</w:t>
+              <w:t xml:space="preserve">Mapear o processo e registrar riscos, controles e plano de ação</w:t>
             </w:r>
           </w:p>
         </w:tc>
@@ -6856,7 +6755,7 @@
                 <w:sz w:val="18"/>
                 <w:szCs w:val="18"/>
               </w:rPr>
-              <w:t xml:space="preserve">Análise técnica e validação (POP-001, item 7.4; Política de Riscos, art. 51)</w:t>
+              <w:t xml:space="preserve">Análise técnica e validação (POP-001, item 7.4)</w:t>
             </w:r>
           </w:p>
         </w:tc>
@@ -7229,7 +7128,7 @@
           <w:sz w:val="20"/>
           <w:szCs w:val="20"/>
         </w:rPr>
-        <w:t xml:space="preserve">Entrega à área gestora o modelo de mapeamento e a Matriz de Riscos, com orientação sobre as categorias de risco da Política.</w:t>
+        <w:t xml:space="preserve">Entrega à área gestora o roteiro de registro de riscos e controles.</w:t>
       </w:r>
     </w:p>
     <w:p>
@@ -7247,7 +7146,7 @@
           <w:sz w:val="20"/>
           <w:szCs w:val="20"/>
         </w:rPr>
-        <w:t xml:space="preserve">Acompanha as reuniões de levantamento de riscos e orienta a classificação e as respostas.</w:t>
+        <w:t xml:space="preserve">Acompanha as reuniões de levantamento de riscos e orienta o registro dos riscos, dos controles e das respostas.</w:t>
       </w:r>
     </w:p>
     <w:p>
@@ -7265,7 +7164,7 @@
           <w:sz w:val="20"/>
           <w:szCs w:val="20"/>
         </w:rPr>
-        <w:t xml:space="preserve">Analisa a minuta e confere: aderência a cada artigo do decreto listado na seção 3, segregação de funções (autorização, aprovação, execução, controle e contabilização), um controle para cada risco relevante, e coerência com o Estatuto, a Política de Riscos, o Regimento e o POP-CENTRAL-001.</w:t>
+        <w:t xml:space="preserve">Analisa a minuta e confere: aderência a cada artigo do decreto listado na seção 3, segregação de funções (autorização, aprovação, execução, controle e contabilização), um controle para cada risco relevante, e coerência com o Estatuto, o Regimento e o POP-CENTRAL-001.</w:t>
       </w:r>
     </w:p>
     <w:p>
@@ -7301,7 +7200,7 @@
           <w:sz w:val="20"/>
           <w:szCs w:val="20"/>
         </w:rPr>
-        <w:t xml:space="preserve">Monitora o plano de ação e leva à Diretoria Executiva os riscos extremos, em relatório (Política de Riscos, art. 27).</w:t>
+        <w:t xml:space="preserve">Monitora o plano de ação e informa a Diretoria Executiva sobre pendências relevantes.</w:t>
       </w:r>
     </w:p>
     <w:p>
@@ -7608,28 +7507,7 @@
           <w:sz w:val="20"/>
           <w:szCs w:val="20"/>
         </w:rPr>
-        <w:t xml:space="preserve">Política de Gestão de Riscos, Conformidade e Controles Internos: arts. 20, 25, 27, 46, 48 a 51. Disponível em </w:t>
-      </w:r>
-      <w:hyperlink w:history="1" r:id="rIdvnhi5b9r90cjx5tltbbb8">
-        <w:r>
-          <w:rPr>
-            <w:rStyle w:val="Hyperlink"/>
-            <w:rFonts w:ascii="Arial" w:cs="Arial" w:eastAsia="Arial" w:hAnsi="Arial"/>
-            <w:color w:val="0563C1"/>
-            <w:sz w:val="20"/>
-            <w:szCs w:val="20"/>
-            <w:u w:val="single"/>
-          </w:rPr>
-          <w:t xml:space="preserve">rj.gov.br/central — Política de Gestão de Riscos</w:t>
-        </w:r>
-      </w:hyperlink>
-      <w:r>
-        <w:rPr>
-          <w:rFonts w:ascii="Arial" w:cs="Arial" w:eastAsia="Arial" w:hAnsi="Arial"/>
-          <w:sz w:val="20"/>
-          <w:szCs w:val="20"/>
-        </w:rPr>
-        <w:t xml:space="preserve">.</w:t>
+        <w:t xml:space="preserve">Regimento Interno da CENTRAL (v1): arts. 13, 18, 19, 22, 30, 35 a 37, 54 e 56. Há proposta de revisão em curso.</w:t>
       </w:r>
     </w:p>
     <w:p>
@@ -7647,27 +7525,9 @@
           <w:sz w:val="20"/>
           <w:szCs w:val="20"/>
         </w:rPr>
-        <w:t xml:space="preserve">Regimento Interno da CENTRAL (v1): arts. 13, 18, 19, 22, 30, 35 a 37, 54 e 56. Há proposta de revisão em curso.</w:t>
-      </w:r>
-    </w:p>
-    <w:p>
-      <w:pPr>
-        <w:pStyle w:val="ListParagraph"/>
-        <w:numPr>
-          <w:ilvl w:val="0"/>
-          <w:numId w:val="2"/>
-        </w:numPr>
-        <w:spacing w:after="60"/>
-      </w:pPr>
-      <w:r>
-        <w:rPr>
-          <w:rFonts w:ascii="Arial" w:cs="Arial" w:eastAsia="Arial" w:hAnsi="Arial"/>
-          <w:sz w:val="20"/>
-          <w:szCs w:val="20"/>
-        </w:rPr>
         <w:t xml:space="preserve">POP-CENTRAL-001, Procedimento para Elaboração de Instrumentos Normativos, v2.0: itens 5, 6 e 7. Disponível em </w:t>
       </w:r>
-      <w:hyperlink w:history="1" r:id="rIds_bl-tugrs-jn-tlbnbhf">
+      <w:hyperlink w:history="1" r:id="rIdkso7a9ocglrer8h0xn8fc">
         <w:r>
           <w:rPr>
             <w:rStyle w:val="Hyperlink"/>

</xml_diff>